<commit_message>
Upload the final correct DOCX file
</commit_message>
<xml_diff>
--- a/REPORT.docx
+++ b/REPORT.docx
@@ -172,52 +172,41 @@
       </w:tr>
     </w:tbl>
     <w:p>
+      <w:pPr>
+        <w:rPr>
+          <w:rFonts w:hint="eastAsia"/>
+          <w:b/>
+        </w:rPr>
+      </w:pPr>
       <w:r>
         <w:rPr>
           <w:b/>
         </w:rPr>
-        <w:t xml:space="preserve">   </w:t>
+        <w:t xml:space="preserve">  </w:t>
       </w:r>
       <w:r>
         <w:rPr>
           <w:b/>
         </w:rPr>
-        <w:t>REG.NO</w:t>
+        <w:t>Reg.no:</w:t>
       </w:r>
       <w:r>
-        <w:t xml:space="preserve">:                                                                                     </w:t>
+        <w:rPr>
+          <w:b/>
+        </w:rPr>
+        <w:t xml:space="preserve">                                                                                       </w:t>
+      </w:r>
+      <w:r>
+        <w:t>25BAI10801</w:t>
       </w:r>
       <w:bookmarkStart w:id="0" w:name="_GoBack"/>
       <w:bookmarkEnd w:id="0"/>
       <w:r>
-        <w:t>25BAI10801</w:t>
+        <w:rPr>
+          <w:b/>
+        </w:rPr>
+        <w:br w:type="page"/>
       </w:r>
-    </w:p>
-    <w:p/>
-    <w:p/>
-    <w:p/>
-    <w:p/>
-    <w:p/>
-    <w:p/>
-    <w:p/>
-    <w:p/>
-    <w:p/>
-    <w:p/>
-    <w:p/>
-    <w:p/>
-    <w:p/>
-    <w:p/>
-    <w:p/>
-    <w:p/>
-    <w:p/>
-    <w:p/>
-    <w:p/>
-    <w:p>
-      <w:pPr>
-        <w:rPr>
-          <w:rFonts w:hint="eastAsia"/>
-        </w:rPr>
-      </w:pPr>
     </w:p>
     <w:p>
       <w:pPr>
@@ -1317,7 +1306,7 @@
   <w:abstractNum w:abstractNumId="9" w15:restartNumberingAfterBreak="0">
     <w:nsid w:val="1482775B"/>
     <w:multiLevelType w:val="multilevel"/>
-    <w:tmpl w:val="7DCEA7EC"/>
+    <w:tmpl w:val="A9C67DFE"/>
     <w:lvl w:ilvl="0">
       <w:start w:val="1"/>
       <w:numFmt w:val="decimal"/>
@@ -1464,6 +1453,36 @@
     <w:abstractNumId w:val="9"/>
   </w:num>
   <w:num w:numId="19">
+    <w:abstractNumId w:val="9"/>
+  </w:num>
+  <w:num w:numId="20">
+    <w:abstractNumId w:val="9"/>
+  </w:num>
+  <w:num w:numId="21">
+    <w:abstractNumId w:val="9"/>
+  </w:num>
+  <w:num w:numId="22">
+    <w:abstractNumId w:val="9"/>
+  </w:num>
+  <w:num w:numId="23">
+    <w:abstractNumId w:val="9"/>
+  </w:num>
+  <w:num w:numId="24">
+    <w:abstractNumId w:val="9"/>
+  </w:num>
+  <w:num w:numId="25">
+    <w:abstractNumId w:val="9"/>
+  </w:num>
+  <w:num w:numId="26">
+    <w:abstractNumId w:val="9"/>
+  </w:num>
+  <w:num w:numId="27">
+    <w:abstractNumId w:val="9"/>
+  </w:num>
+  <w:num w:numId="28">
+    <w:abstractNumId w:val="9"/>
+  </w:num>
+  <w:num w:numId="29">
     <w:abstractNumId w:val="9"/>
   </w:num>
 </w:numbering>
@@ -1861,7 +1880,7 @@
   <w:style w:type="paragraph" w:default="1" w:styleId="Normal">
     <w:name w:val="Normal"/>
     <w:qFormat/>
-    <w:rsid w:val="00B76358"/>
+    <w:rsid w:val="00D344BC"/>
   </w:style>
   <w:style w:type="paragraph" w:styleId="Heading1">
     <w:name w:val="heading 1"/>
@@ -1870,12 +1889,12 @@
     <w:link w:val="Heading1Char"/>
     <w:uiPriority w:val="9"/>
     <w:qFormat/>
-    <w:rsid w:val="00B76358"/>
+    <w:rsid w:val="00D344BC"/>
     <w:pPr>
       <w:keepNext/>
       <w:keepLines/>
       <w:numPr>
-        <w:numId w:val="19"/>
+        <w:numId w:val="29"/>
       </w:numPr>
       <w:pBdr>
         <w:bottom w:val="single" w:sz="4" w:space="1" w:color="595959" w:themeColor="text1" w:themeTint="A6"/>
@@ -1901,13 +1920,13 @@
     <w:uiPriority w:val="9"/>
     <w:unhideWhenUsed/>
     <w:qFormat/>
-    <w:rsid w:val="00B76358"/>
+    <w:rsid w:val="00D344BC"/>
     <w:pPr>
       <w:keepNext/>
       <w:keepLines/>
       <w:numPr>
         <w:ilvl w:val="1"/>
-        <w:numId w:val="19"/>
+        <w:numId w:val="29"/>
       </w:numPr>
       <w:spacing w:before="360" w:after="0"/>
       <w:outlineLvl w:val="1"/>
@@ -1930,13 +1949,13 @@
     <w:uiPriority w:val="9"/>
     <w:unhideWhenUsed/>
     <w:qFormat/>
-    <w:rsid w:val="00B76358"/>
+    <w:rsid w:val="00D344BC"/>
     <w:pPr>
       <w:keepNext/>
       <w:keepLines/>
       <w:numPr>
         <w:ilvl w:val="2"/>
-        <w:numId w:val="19"/>
+        <w:numId w:val="29"/>
       </w:numPr>
       <w:spacing w:before="200" w:after="0"/>
       <w:outlineLvl w:val="2"/>
@@ -1957,13 +1976,13 @@
     <w:semiHidden/>
     <w:unhideWhenUsed/>
     <w:qFormat/>
-    <w:rsid w:val="00B76358"/>
+    <w:rsid w:val="00D344BC"/>
     <w:pPr>
       <w:keepNext/>
       <w:keepLines/>
       <w:numPr>
         <w:ilvl w:val="3"/>
-        <w:numId w:val="19"/>
+        <w:numId w:val="29"/>
       </w:numPr>
       <w:spacing w:before="200" w:after="0"/>
       <w:outlineLvl w:val="3"/>
@@ -1986,13 +2005,13 @@
     <w:semiHidden/>
     <w:unhideWhenUsed/>
     <w:qFormat/>
-    <w:rsid w:val="00B76358"/>
+    <w:rsid w:val="00D344BC"/>
     <w:pPr>
       <w:keepNext/>
       <w:keepLines/>
       <w:numPr>
         <w:ilvl w:val="4"/>
-        <w:numId w:val="19"/>
+        <w:numId w:val="29"/>
       </w:numPr>
       <w:spacing w:before="200" w:after="0"/>
       <w:outlineLvl w:val="4"/>
@@ -2011,13 +2030,13 @@
     <w:semiHidden/>
     <w:unhideWhenUsed/>
     <w:qFormat/>
-    <w:rsid w:val="00B76358"/>
+    <w:rsid w:val="00D344BC"/>
     <w:pPr>
       <w:keepNext/>
       <w:keepLines/>
       <w:numPr>
         <w:ilvl w:val="5"/>
-        <w:numId w:val="19"/>
+        <w:numId w:val="29"/>
       </w:numPr>
       <w:spacing w:before="200" w:after="0"/>
       <w:outlineLvl w:val="5"/>
@@ -2038,13 +2057,13 @@
     <w:semiHidden/>
     <w:unhideWhenUsed/>
     <w:qFormat/>
-    <w:rsid w:val="00B76358"/>
+    <w:rsid w:val="00D344BC"/>
     <w:pPr>
       <w:keepNext/>
       <w:keepLines/>
       <w:numPr>
         <w:ilvl w:val="6"/>
-        <w:numId w:val="19"/>
+        <w:numId w:val="29"/>
       </w:numPr>
       <w:spacing w:before="200" w:after="0"/>
       <w:outlineLvl w:val="6"/>
@@ -2065,13 +2084,13 @@
     <w:semiHidden/>
     <w:unhideWhenUsed/>
     <w:qFormat/>
-    <w:rsid w:val="00B76358"/>
+    <w:rsid w:val="00D344BC"/>
     <w:pPr>
       <w:keepNext/>
       <w:keepLines/>
       <w:numPr>
         <w:ilvl w:val="7"/>
-        <w:numId w:val="19"/>
+        <w:numId w:val="29"/>
       </w:numPr>
       <w:spacing w:before="200" w:after="0"/>
       <w:outlineLvl w:val="7"/>
@@ -2092,13 +2111,13 @@
     <w:semiHidden/>
     <w:unhideWhenUsed/>
     <w:qFormat/>
-    <w:rsid w:val="00B76358"/>
+    <w:rsid w:val="00D344BC"/>
     <w:pPr>
       <w:keepNext/>
       <w:keepLines/>
       <w:numPr>
         <w:ilvl w:val="8"/>
-        <w:numId w:val="19"/>
+        <w:numId w:val="29"/>
       </w:numPr>
       <w:spacing w:before="200" w:after="0"/>
       <w:outlineLvl w:val="8"/>
@@ -2187,7 +2206,7 @@
     <w:name w:val="No Spacing"/>
     <w:uiPriority w:val="1"/>
     <w:qFormat/>
-    <w:rsid w:val="00B76358"/>
+    <w:rsid w:val="00D344BC"/>
     <w:pPr>
       <w:spacing w:after="0" w:line="240" w:lineRule="auto"/>
     </w:pPr>
@@ -2197,7 +2216,7 @@
     <w:basedOn w:val="DefaultParagraphFont"/>
     <w:link w:val="Heading1"/>
     <w:uiPriority w:val="9"/>
-    <w:rsid w:val="00B76358"/>
+    <w:rsid w:val="00D344BC"/>
     <w:rPr>
       <w:rFonts w:asciiTheme="majorHAnsi" w:eastAsiaTheme="majorEastAsia" w:hAnsiTheme="majorHAnsi" w:cstheme="majorBidi"/>
       <w:b/>
@@ -2213,7 +2232,7 @@
     <w:basedOn w:val="DefaultParagraphFont"/>
     <w:link w:val="Heading2"/>
     <w:uiPriority w:val="9"/>
-    <w:rsid w:val="00B76358"/>
+    <w:rsid w:val="00D344BC"/>
     <w:rPr>
       <w:rFonts w:asciiTheme="majorHAnsi" w:eastAsiaTheme="majorEastAsia" w:hAnsiTheme="majorHAnsi" w:cstheme="majorBidi"/>
       <w:b/>
@@ -2229,7 +2248,7 @@
     <w:basedOn w:val="DefaultParagraphFont"/>
     <w:link w:val="Heading3"/>
     <w:uiPriority w:val="9"/>
-    <w:rsid w:val="00B76358"/>
+    <w:rsid w:val="00D344BC"/>
     <w:rPr>
       <w:rFonts w:asciiTheme="majorHAnsi" w:eastAsiaTheme="majorEastAsia" w:hAnsiTheme="majorHAnsi" w:cstheme="majorBidi"/>
       <w:b/>
@@ -2244,7 +2263,7 @@
     <w:link w:val="TitleChar"/>
     <w:uiPriority w:val="10"/>
     <w:qFormat/>
-    <w:rsid w:val="00B76358"/>
+    <w:rsid w:val="00D344BC"/>
     <w:pPr>
       <w:spacing w:after="0" w:line="240" w:lineRule="auto"/>
       <w:contextualSpacing/>
@@ -2261,7 +2280,7 @@
     <w:basedOn w:val="DefaultParagraphFont"/>
     <w:link w:val="Title"/>
     <w:uiPriority w:val="10"/>
-    <w:rsid w:val="00B76358"/>
+    <w:rsid w:val="00D344BC"/>
     <w:rPr>
       <w:rFonts w:asciiTheme="majorHAnsi" w:eastAsiaTheme="majorEastAsia" w:hAnsiTheme="majorHAnsi" w:cstheme="majorBidi"/>
       <w:color w:val="000000" w:themeColor="text1"/>
@@ -2276,7 +2295,7 @@
     <w:link w:val="SubtitleChar"/>
     <w:uiPriority w:val="11"/>
     <w:qFormat/>
-    <w:rsid w:val="00B76358"/>
+    <w:rsid w:val="00D344BC"/>
     <w:pPr>
       <w:numPr>
         <w:ilvl w:val="1"/>
@@ -2292,7 +2311,7 @@
     <w:basedOn w:val="DefaultParagraphFont"/>
     <w:link w:val="Subtitle"/>
     <w:uiPriority w:val="11"/>
-    <w:rsid w:val="00B76358"/>
+    <w:rsid w:val="00D344BC"/>
     <w:rPr>
       <w:color w:val="5A5A5A" w:themeColor="text1" w:themeTint="A5"/>
       <w:spacing w:val="10"/>
@@ -2560,7 +2579,7 @@
     <w:link w:val="QuoteChar"/>
     <w:uiPriority w:val="29"/>
     <w:qFormat/>
-    <w:rsid w:val="00B76358"/>
+    <w:rsid w:val="00D344BC"/>
     <w:pPr>
       <w:spacing w:before="160"/>
       <w:ind w:left="720" w:right="720"/>
@@ -2576,7 +2595,7 @@
     <w:basedOn w:val="DefaultParagraphFont"/>
     <w:link w:val="Quote"/>
     <w:uiPriority w:val="29"/>
-    <w:rsid w:val="00B76358"/>
+    <w:rsid w:val="00D344BC"/>
     <w:rPr>
       <w:i/>
       <w:iCs/>
@@ -2589,7 +2608,7 @@
     <w:link w:val="Heading4"/>
     <w:uiPriority w:val="9"/>
     <w:semiHidden/>
-    <w:rsid w:val="00B76358"/>
+    <w:rsid w:val="00D344BC"/>
     <w:rPr>
       <w:rFonts w:asciiTheme="majorHAnsi" w:eastAsiaTheme="majorEastAsia" w:hAnsiTheme="majorHAnsi" w:cstheme="majorBidi"/>
       <w:b/>
@@ -2605,7 +2624,7 @@
     <w:link w:val="Heading5"/>
     <w:uiPriority w:val="9"/>
     <w:semiHidden/>
-    <w:rsid w:val="00B76358"/>
+    <w:rsid w:val="00D344BC"/>
     <w:rPr>
       <w:rFonts w:asciiTheme="majorHAnsi" w:eastAsiaTheme="majorEastAsia" w:hAnsiTheme="majorHAnsi" w:cstheme="majorBidi"/>
       <w:color w:val="17365D" w:themeColor="text2" w:themeShade="BF"/>
@@ -2617,7 +2636,7 @@
     <w:link w:val="Heading6"/>
     <w:uiPriority w:val="9"/>
     <w:semiHidden/>
-    <w:rsid w:val="00B76358"/>
+    <w:rsid w:val="00D344BC"/>
     <w:rPr>
       <w:rFonts w:asciiTheme="majorHAnsi" w:eastAsiaTheme="majorEastAsia" w:hAnsiTheme="majorHAnsi" w:cstheme="majorBidi"/>
       <w:i/>
@@ -2631,7 +2650,7 @@
     <w:link w:val="Heading7"/>
     <w:uiPriority w:val="9"/>
     <w:semiHidden/>
-    <w:rsid w:val="00B76358"/>
+    <w:rsid w:val="00D344BC"/>
     <w:rPr>
       <w:rFonts w:asciiTheme="majorHAnsi" w:eastAsiaTheme="majorEastAsia" w:hAnsiTheme="majorHAnsi" w:cstheme="majorBidi"/>
       <w:i/>
@@ -2645,7 +2664,7 @@
     <w:link w:val="Heading8"/>
     <w:uiPriority w:val="9"/>
     <w:semiHidden/>
-    <w:rsid w:val="00B76358"/>
+    <w:rsid w:val="00D344BC"/>
     <w:rPr>
       <w:rFonts w:asciiTheme="majorHAnsi" w:eastAsiaTheme="majorEastAsia" w:hAnsiTheme="majorHAnsi" w:cstheme="majorBidi"/>
       <w:color w:val="404040" w:themeColor="text1" w:themeTint="BF"/>
@@ -2659,7 +2678,7 @@
     <w:link w:val="Heading9"/>
     <w:uiPriority w:val="9"/>
     <w:semiHidden/>
-    <w:rsid w:val="00B76358"/>
+    <w:rsid w:val="00D344BC"/>
     <w:rPr>
       <w:rFonts w:asciiTheme="majorHAnsi" w:eastAsiaTheme="majorEastAsia" w:hAnsiTheme="majorHAnsi" w:cstheme="majorBidi"/>
       <w:i/>
@@ -2677,7 +2696,7 @@
     <w:semiHidden/>
     <w:unhideWhenUsed/>
     <w:qFormat/>
-    <w:rsid w:val="00B76358"/>
+    <w:rsid w:val="00D344BC"/>
     <w:pPr>
       <w:spacing w:after="200" w:line="240" w:lineRule="auto"/>
     </w:pPr>
@@ -2694,7 +2713,7 @@
     <w:basedOn w:val="DefaultParagraphFont"/>
     <w:uiPriority w:val="22"/>
     <w:qFormat/>
-    <w:rsid w:val="00B76358"/>
+    <w:rsid w:val="00D344BC"/>
     <w:rPr>
       <w:b/>
       <w:bCs/>
@@ -2706,7 +2725,7 @@
     <w:basedOn w:val="DefaultParagraphFont"/>
     <w:uiPriority w:val="20"/>
     <w:qFormat/>
-    <w:rsid w:val="00B76358"/>
+    <w:rsid w:val="00D344BC"/>
     <w:rPr>
       <w:i/>
       <w:iCs/>
@@ -2720,7 +2739,7 @@
     <w:link w:val="IntenseQuoteChar"/>
     <w:uiPriority w:val="30"/>
     <w:qFormat/>
-    <w:rsid w:val="00B76358"/>
+    <w:rsid w:val="00D344BC"/>
     <w:pPr>
       <w:pBdr>
         <w:top w:val="single" w:sz="24" w:space="1" w:color="F2F2F2" w:themeColor="background1" w:themeShade="F2"/>
@@ -2740,7 +2759,7 @@
     <w:basedOn w:val="DefaultParagraphFont"/>
     <w:link w:val="IntenseQuote"/>
     <w:uiPriority w:val="30"/>
-    <w:rsid w:val="00B76358"/>
+    <w:rsid w:val="00D344BC"/>
     <w:rPr>
       <w:color w:val="000000" w:themeColor="text1"/>
       <w:shd w:val="clear" w:color="auto" w:fill="F2F2F2" w:themeFill="background1" w:themeFillShade="F2"/>
@@ -2751,7 +2770,7 @@
     <w:basedOn w:val="DefaultParagraphFont"/>
     <w:uiPriority w:val="19"/>
     <w:qFormat/>
-    <w:rsid w:val="00B76358"/>
+    <w:rsid w:val="00D344BC"/>
     <w:rPr>
       <w:i/>
       <w:iCs/>
@@ -2763,7 +2782,7 @@
     <w:basedOn w:val="DefaultParagraphFont"/>
     <w:uiPriority w:val="21"/>
     <w:qFormat/>
-    <w:rsid w:val="00B76358"/>
+    <w:rsid w:val="00D344BC"/>
     <w:rPr>
       <w:b/>
       <w:bCs/>
@@ -2777,7 +2796,7 @@
     <w:basedOn w:val="DefaultParagraphFont"/>
     <w:uiPriority w:val="31"/>
     <w:qFormat/>
-    <w:rsid w:val="00B76358"/>
+    <w:rsid w:val="00D344BC"/>
     <w:rPr>
       <w:smallCaps/>
       <w:color w:val="404040" w:themeColor="text1" w:themeTint="BF"/>
@@ -2789,7 +2808,7 @@
     <w:basedOn w:val="DefaultParagraphFont"/>
     <w:uiPriority w:val="32"/>
     <w:qFormat/>
-    <w:rsid w:val="00B76358"/>
+    <w:rsid w:val="00D344BC"/>
     <w:rPr>
       <w:b/>
       <w:bCs/>
@@ -2802,7 +2821,7 @@
     <w:basedOn w:val="DefaultParagraphFont"/>
     <w:uiPriority w:val="33"/>
     <w:qFormat/>
-    <w:rsid w:val="00B76358"/>
+    <w:rsid w:val="00D344BC"/>
     <w:rPr>
       <w:b w:val="0"/>
       <w:bCs w:val="0"/>
@@ -2818,7 +2837,7 @@
     <w:semiHidden/>
     <w:unhideWhenUsed/>
     <w:qFormat/>
-    <w:rsid w:val="00B76358"/>
+    <w:rsid w:val="00D344BC"/>
     <w:pPr>
       <w:outlineLvl w:val="9"/>
     </w:pPr>
@@ -13205,7 +13224,7 @@
 </file>
 
 <file path=customXml/itemProps1.xml><?xml version="1.0" encoding="utf-8"?>
-<ds:datastoreItem xmlns:ds="http://schemas.openxmlformats.org/officeDocument/2006/customXml" ds:itemID="{4E384F76-F4CB-48BC-9A20-9CC9F6B10B54}">
+<ds:datastoreItem xmlns:ds="http://schemas.openxmlformats.org/officeDocument/2006/customXml" ds:itemID="{2C30CC49-3839-4FB3-A15E-41D4ECDF1129}">
   <ds:schemaRefs>
     <ds:schemaRef ds:uri="http://schemas.openxmlformats.org/officeDocument/2006/bibliography"/>
   </ds:schemaRefs>

</xml_diff>